<commit_message>
Phase 2: Authentication & Multi-Tenant Role-Based Access Control (RBAC)
</commit_message>
<xml_diff>
--- a/docs/EduSupervision_CTO_Journal.docx
+++ b/docs/EduSupervision_CTO_Journal.docx
@@ -7377,6 +7377,109 @@
     </w:p>
     <w:p>
       <w:pPr>
+        <w:pStyle w:val="Heading1"/>
+        <w:jc w:val="left"/>
+      </w:pPr>
+      <w:r>
+        <w:rPr>
+          <w:color w:val="4F46E5"/>
+        </w:rPr>
+        <w:t>15. Phase 2 — Authentication &amp; Multi-Tenant RBAC (CTO Journal)</w:t>
+      </w:r>
+    </w:p>
+    <w:p>
+      <w:pPr>
+        <w:pBdr>
+          <w:bottom w:val="single" w:sz="6" w:space="1" w:color="4F46E5"/>
+        </w:pBdr>
+      </w:pPr>
+    </w:p>
+    <w:p>
+      <w:r>
+        <w:rPr>
+          <w:b w:val="0"/>
+          <w:sz w:val="22"/>
+        </w:rPr>
+        <w:t>Phase 2 secures the platform utilizing stateless asymmetric RS256 JWT tokens. The Edge Middleware (Next.js) and API Gateway (FastAPI) collaborate to enforce permissions.</w:t>
+      </w:r>
+    </w:p>
+    <w:p>
+      <w:pPr>
+        <w:pStyle w:val="Heading2"/>
+        <w:jc w:val="left"/>
+      </w:pPr>
+      <w:r>
+        <w:t>15.1 Asymmetric Signature Verification Sequence</w:t>
+      </w:r>
+    </w:p>
+    <w:p>
+      <w:r>
+        <w:rPr>
+          <w:b w:val="0"/>
+          <w:sz w:val="22"/>
+        </w:rPr>
+        <w:t>The FastAPI backend signs JWTs using an RS256 private key, while Next.js Edge Middleware verifies them at the edge using only the public key, bypassing internal database network overhead.</w:t>
+      </w:r>
+    </w:p>
+    <w:p>
+      <w:pPr>
+        <w:ind w:left="576" w:right="576"/>
+        <w:shd w:val="clear" w:color="auto" w:fill="1E1E2E"/>
+      </w:pPr>
+      <w:r>
+        <w:rPr>
+          <w:rFonts w:ascii="Cascadia Code" w:hAnsi="Cascadia Code"/>
+          <w:color w:val="A6E3A1"/>
+          <w:sz w:val="18"/>
+        </w:rPr>
+        <w:t>[User Client Browser]</w:t>
+        <w:br/>
+        <w:t xml:space="preserve">       │  (Requests /admin/dashboard with HttpOnly cookie)</w:t>
+        <w:br/>
+        <w:t xml:space="preserve">       ▼</w:t>
+        <w:br/>
+        <w:t>[Next.js Edge Middleware]</w:t>
+        <w:br/>
+        <w:t xml:space="preserve">       │  (Imports RS256 public key)</w:t>
+        <w:br/>
+        <w:t xml:space="preserve">       ├─► Decodes &amp; Verifies Refresh Token</w:t>
+        <w:br/>
+        <w:t xml:space="preserve">       ├─► Checks payload.role == 'InstitutionAdmin'</w:t>
+        <w:br/>
+        <w:t xml:space="preserve">       │        YES ──► Inject headers &amp; Proceed</w:t>
+        <w:br/>
+        <w:t xml:space="preserve">       │        NO   ──► Redirect to /teacher/dashboard</w:t>
+        <w:br/>
+        <w:t xml:space="preserve">       ▼</w:t>
+        <w:br/>
+        <w:t>[FastAPI Endpoints] (Enforces database queries scoped to payload.institution_id)</w:t>
+      </w:r>
+    </w:p>
+    <w:p>
+      <w:pPr>
+        <w:pStyle w:val="Heading2"/>
+        <w:jc w:val="left"/>
+      </w:pPr>
+      <w:r>
+        <w:t>15.2 Cookie Storage Policies &amp; Replay Attack Mitigations</w:t>
+      </w:r>
+    </w:p>
+    <w:p>
+      <w:r>
+        <w:rPr>
+          <w:b w:val="0"/>
+          <w:sz w:val="22"/>
+        </w:rPr>
+        <w:t>Access tokens expire in 15 minutes and live solely in-memory. Refresh tokens expire in 7 days, stored as HttpOnly, Secure, SameSite=Strict cookies. On token rotation (/refresh), the old token is blacklisted in Redis for its remaining time-to-live to prevent reuse.</w:t>
+      </w:r>
+    </w:p>
+    <w:p>
+      <w:r>
+        <w:br w:type="page"/>
+      </w:r>
+    </w:p>
+    <w:p>
+      <w:pPr>
         <w:jc w:val="center"/>
       </w:pPr>
       <w:r>
@@ -7396,7 +7499,7 @@
         <w:rPr>
           <w:sz w:val="18"/>
         </w:rPr>
-        <w:t>Document generated: May 28, 2026 at 17:18  |  EduSupervision Engineering  |  All contents confidential</w:t>
+        <w:t>Document generated: May 28, 2026 at 17:25  |  EduSupervision Engineering  |  All contents confidential</w:t>
       </w:r>
     </w:p>
     <w:sectPr>

</xml_diff>

<commit_message>
Phase 3: Academic Administration & Teacher Onboarding
</commit_message>
<xml_diff>
--- a/docs/EduSupervision_CTO_Journal.docx
+++ b/docs/EduSupervision_CTO_Journal.docx
@@ -7480,6 +7480,121 @@
     </w:p>
     <w:p>
       <w:pPr>
+        <w:pStyle w:val="Heading1"/>
+        <w:jc w:val="left"/>
+      </w:pPr>
+      <w:r>
+        <w:rPr>
+          <w:color w:val="4F46E5"/>
+        </w:rPr>
+        <w:t>16. Phase 3 — Academic Administration &amp; Teacher Onboarding (CTO Journal)</w:t>
+      </w:r>
+    </w:p>
+    <w:p>
+      <w:pPr>
+        <w:pBdr>
+          <w:bottom w:val="single" w:sz="6" w:space="1" w:color="4F46E5"/>
+        </w:pBdr>
+      </w:pPr>
+    </w:p>
+    <w:p>
+      <w:r>
+        <w:rPr>
+          <w:b w:val="0"/>
+          <w:sz w:val="22"/>
+        </w:rPr>
+        <w:t>Phase 3 establishes the tenant provisioning, user registration loops, and administrative portals. Async tasks manage background welcome emails and secure token delivery.</w:t>
+      </w:r>
+    </w:p>
+    <w:p>
+      <w:pPr>
+        <w:pStyle w:val="Heading2"/>
+        <w:jc w:val="left"/>
+      </w:pPr>
+      <w:r>
+        <w:t>16.1 Admin Invitation &amp; Registration Verification Flow</w:t>
+      </w:r>
+    </w:p>
+    <w:p>
+      <w:r>
+        <w:rPr>
+          <w:b w:val="0"/>
+          <w:sz w:val="22"/>
+        </w:rPr>
+        <w:t>To coordinate bulk invites, administrators trigger an endpoint sending temporary registration tokens to educators. The flow manages state transition from pending_verification to active.</w:t>
+      </w:r>
+    </w:p>
+    <w:p>
+      <w:pPr>
+        <w:ind w:left="576" w:right="576"/>
+        <w:shd w:val="clear" w:color="auto" w:fill="1E1E2E"/>
+      </w:pPr>
+      <w:r>
+        <w:rPr>
+          <w:rFonts w:ascii="Cascadia Code" w:hAnsi="Cascadia Code"/>
+          <w:color w:val="A6E3A1"/>
+          <w:sz w:val="18"/>
+        </w:rPr>
+        <w:t>[Admin Portal (Roster)]</w:t>
+        <w:br/>
+        <w:t xml:space="preserve">       │  (Invites list of email addresses)</w:t>
+        <w:br/>
+        <w:t xml:space="preserve">       ▼</w:t>
+        <w:br/>
+        <w:t>[FastAPI /teachers/invite]</w:t>
+        <w:br/>
+        <w:t xml:space="preserve">       │  (Generates 72-hour invite JWT token)</w:t>
+        <w:br/>
+        <w:t xml:space="preserve">       ▼</w:t>
+        <w:br/>
+        <w:t>[Celery Email Worker] ──► Mocks SMTP Outbound Transmission</w:t>
+        <w:br/>
+        <w:t xml:space="preserve">       │</w:t>
+        <w:br/>
+        <w:t xml:space="preserve">       ▼  (Teacher clicks activation link /register/{token})</w:t>
+        <w:br/>
+        <w:t>[Next.js Registration Page] ──► Submits password, name, employee_id</w:t>
+        <w:br/>
+        <w:t xml:space="preserve">       │</w:t>
+        <w:br/>
+        <w:t xml:space="preserve">       ▼</w:t>
+        <w:br/>
+        <w:t>[FastAPI /teachers/register/{token}]</w:t>
+        <w:br/>
+        <w:t xml:space="preserve">       ├─► Decodes &amp; Validates token</w:t>
+        <w:br/>
+        <w:t xml:space="preserve">       ├─► Hashes password via pbkdf2_sha256</w:t>
+        <w:br/>
+        <w:t xml:space="preserve">       ├─► Updates user status = 'active'</w:t>
+        <w:br/>
+        <w:t xml:space="preserve">       └─► Inserts Profile record</w:t>
+      </w:r>
+    </w:p>
+    <w:p>
+      <w:pPr>
+        <w:pStyle w:val="Heading2"/>
+        <w:jc w:val="left"/>
+      </w:pPr>
+      <w:r>
+        <w:t>16.2 Tenant Provisioning Scopes</w:t>
+      </w:r>
+    </w:p>
+    <w:p>
+      <w:r>
+        <w:rPr>
+          <w:b w:val="0"/>
+          <w:sz w:val="22"/>
+        </w:rPr>
+        <w:t>SuperAdmin provisions new organizations (POST /institutions). The provisioning inserts the Institution record, creates the primary administrator, and schedules the administrator welcome email. Multi-tenant constraints are permanently linked at the profile and user layers.</w:t>
+      </w:r>
+    </w:p>
+    <w:p>
+      <w:r>
+        <w:br w:type="page"/>
+      </w:r>
+    </w:p>
+    <w:p>
+      <w:pPr>
         <w:jc w:val="center"/>
       </w:pPr>
       <w:r>
@@ -7499,7 +7614,7 @@
         <w:rPr>
           <w:sz w:val="18"/>
         </w:rPr>
-        <w:t>Document generated: May 28, 2026 at 17:25  |  EduSupervision Engineering  |  All contents confidential</w:t>
+        <w:t>Document generated: May 28, 2026 at 17:28  |  EduSupervision Engineering  |  All contents confidential</w:t>
       </w:r>
     </w:p>
     <w:sectPr>

</xml_diff>

<commit_message>
feat: Phase 4 - Training Content Delivery & Video Telemetry complete with local mock uploads and progress player tracking
</commit_message>
<xml_diff>
--- a/docs/EduSupervision_CTO_Journal.docx
+++ b/docs/EduSupervision_CTO_Journal.docx
@@ -7595,6 +7595,111 @@
     </w:p>
     <w:p>
       <w:pPr>
+        <w:pStyle w:val="Heading1"/>
+        <w:jc w:val="left"/>
+      </w:pPr>
+      <w:r>
+        <w:rPr>
+          <w:color w:val="4F46E5"/>
+        </w:rPr>
+        <w:t>17. Phase 4 — Training Content Delivery &amp; Video Telemetry (CTO Journal)</w:t>
+      </w:r>
+    </w:p>
+    <w:p>
+      <w:pPr>
+        <w:pBdr>
+          <w:bottom w:val="single" w:sz="6" w:space="1" w:color="4F46E5"/>
+        </w:pBdr>
+      </w:pPr>
+    </w:p>
+    <w:p>
+      <w:r>
+        <w:rPr>
+          <w:b w:val="0"/>
+          <w:sz w:val="22"/>
+        </w:rPr>
+        <w:t>Phase 4 builds the core training materials pipeline. Administrators upload PDFs/videos directly via direct uploads, and teachers stream materials with precise, low-overhead progress telemetry.</w:t>
+      </w:r>
+    </w:p>
+    <w:p>
+      <w:pPr>
+        <w:pStyle w:val="Heading2"/>
+        <w:jc w:val="left"/>
+      </w:pPr>
+      <w:r>
+        <w:t>17.1 Direct Upload Presigning &amp; Fallback Loop</w:t>
+      </w:r>
+    </w:p>
+    <w:p>
+      <w:r>
+        <w:rPr>
+          <w:b w:val="0"/>
+          <w:sz w:val="22"/>
+        </w:rPr>
+        <w:t>To support offline local dev at zero cost, the platform implements a dual-path upload loop. If AWS configurations are missing, backend generates local server mock URLs. Frontend executes PUT requests directly to the target destination, keeping the code matching production S3 behavior.</w:t>
+      </w:r>
+    </w:p>
+    <w:p>
+      <w:pPr>
+        <w:ind w:left="576" w:right="576"/>
+        <w:shd w:val="clear" w:color="auto" w:fill="1E1E2E"/>
+      </w:pPr>
+      <w:r>
+        <w:rPr>
+          <w:rFonts w:ascii="Cascadia Code" w:hAnsi="Cascadia Code"/>
+          <w:color w:val="A6E3A1"/>
+          <w:sz w:val="18"/>
+        </w:rPr>
+        <w:t>[Admin Upload Dropzone]</w:t>
+        <w:br/>
+        <w:t xml:space="preserve">       │  (Acquires upload URL from API)</w:t>
+        <w:br/>
+        <w:t xml:space="preserve">       ▼</w:t>
+        <w:br/>
+        <w:t xml:space="preserve">[FastAPI /materials/presign] </w:t>
+        <w:br/>
+        <w:t xml:space="preserve">       ├─► AWS active  ──► Return AWS S3 Presigned PUT URL</w:t>
+        <w:br/>
+        <w:t xml:space="preserve">       └─► AWS missing ──► Return Local FastAPI PUT Endpoint</w:t>
+        <w:br/>
+        <w:t xml:space="preserve">       │</w:t>
+        <w:br/>
+        <w:t xml:space="preserve">       ▼  (Browser performs client-side direct PUT upload)</w:t>
+        <w:br/>
+        <w:t>[Target Destination] ──► Uploads directly to S3 or writes local disk</w:t>
+        <w:br/>
+        <w:t xml:space="preserve">       │</w:t>
+        <w:br/>
+        <w:t xml:space="preserve">       ▼  (Admin submits course metadata form)</w:t>
+        <w:br/>
+        <w:t>[FastAPI POST /materials] ──► Saves file_url/s3_key to DB</w:t>
+      </w:r>
+    </w:p>
+    <w:p>
+      <w:pPr>
+        <w:pStyle w:val="Heading2"/>
+        <w:jc w:val="left"/>
+      </w:pPr>
+      <w:r>
+        <w:t>17.2 Telemetry Progress Throttling &amp; keepalive Flush</w:t>
+      </w:r>
+    </w:p>
+    <w:p>
+      <w:r>
+        <w:rPr>
+          <w:b w:val="0"/>
+          <w:sz w:val="22"/>
+        </w:rPr>
+        <w:t>Video telemetry captures continuous player playtime positions. To optimize performance, updates are saved to sessionStorage on timeupdate, throttled to 30-second interval updates to the DB during playback, and flushed using keepalive fetch when tab is backgrounded or closed.</w:t>
+      </w:r>
+    </w:p>
+    <w:p>
+      <w:r>
+        <w:br w:type="page"/>
+      </w:r>
+    </w:p>
+    <w:p>
+      <w:pPr>
         <w:jc w:val="center"/>
       </w:pPr>
       <w:r>
@@ -7614,7 +7719,7 @@
         <w:rPr>
           <w:sz w:val="18"/>
         </w:rPr>
-        <w:t>Document generated: May 28, 2026 at 17:28  |  EduSupervision Engineering  |  All contents confidential</w:t>
+        <w:t>Document generated: May 28, 2026 at 17:35  |  EduSupervision Engineering  |  All contents confidential</w:t>
       </w:r>
     </w:p>
     <w:sectPr>

</xml_diff>